<commit_message>
Updating single-cell SOP, removing unused variables dynamically.
</commit_message>
<xml_diff>
--- a/single_cell_standard_pipeline/single-cell Standard Operating Procedure.docx
+++ b/single_cell_standard_pipeline/single-cell Standard Operating Procedure.docx
@@ -57,7 +57,7 @@
         <w:t>Version:</w:t>
       </w:r>
       <w:r>
-        <w:t xml:space="preserve"> 5.1 | </w:t>
+        <w:t xml:space="preserve"> 6.0 | </w:t>
       </w:r>
       <w:r>
         <w:rPr>
@@ -168,7 +168,7 @@
         <w:t>01_process_data.R</w:t>
       </w:r>
       <w:r>
-        <w:t>): Handles all automated computational steps including data loading, quality control, doublet detection with a rollback safeguard, ambient RNA correction, dimensionality reduction, and batch integration. Typically run once by a computational user. Outputs a fully processed but unannotated Seurat object.</w:t>
+        <w:t>): Handles all automated computational steps including per-sample data loading, optional SCEVAN CNA detection, pre-merge QC, per-sample DecontX ambient RNA correction (with optional integer rounding), per-sample DoubletFinder detection and removal with a rollback safeguard, post-merge QC, dimensionality reduction, and Harmony batch integration. Typically run once by a computational user. Outputs a fully processed but unannotated Seurat object.</w:t>
       </w:r>
     </w:p>
     <w:p>
@@ -202,7 +202,6 @@
         <w:rPr>
           <w:b/>
         </w:rPr>
-        <w:lastRenderedPageBreak/>
         <w:t>Script 03 — Differential Expression</w:t>
       </w:r>
       <w:r>
@@ -215,7 +214,9 @@
         <w:t>03_differential_expression.R</w:t>
       </w:r>
       <w:r>
-        <w:t>): Performs between-group differential gene expression (Wilcoxon) and differential variability analysis (SplineDV) with downstream ranked GSEA (fgsea) and over-representation analysis (Enrichr ORA).</w:t>
+        <w:t xml:space="preserve">): Performs between-group differential gene expression (Wilcoxon) and differential variability analysis </w:t>
+        <w:lastRenderedPageBreak/>
+        <w:t>(SplineDV) with downstream ranked GSEA (fgsea) and over-representation analysis (Enrichr ORA).</w:t>
       </w:r>
     </w:p>
     <w:p>
@@ -459,7 +460,7 @@
       </w:tblPr>
       <w:tblGrid>
         <w:gridCol w:w="2484"/>
-        <w:gridCol w:w="4486"/>
+        <w:gridCol w:w="5840"/>
       </w:tblGrid>
       <w:tr>
         <w:tc>
@@ -900,7 +901,6 @@
     </w:p>
     <w:p>
       <w:r>
-        <w:lastRenderedPageBreak/>
         <w:pict w14:anchorId="5327070B">
           <v:rect id="_x0000_i1027" style="width:0;height:1.5pt" o:hralign="center" o:hrstd="t" o:hr="t"/>
         </w:pict>
@@ -912,6 +912,7 @@
       </w:pPr>
       <w:bookmarkStart w:id="7" w:name="metadata-file-configuration"/>
       <w:r>
+        <w:lastRenderedPageBreak/>
         <w:t>3. Metadata File Configuration</w:t>
       </w:r>
       <w:bookmarkEnd w:id="7"/>
@@ -1989,7 +1990,6 @@
               <w:rPr>
                 <w:rStyle w:val="VerbatimChar"/>
               </w:rPr>
-              <w:lastRenderedPageBreak/>
               <w:t>"Diet_Timepoint"</w:t>
             </w:r>
           </w:p>
@@ -2051,6 +2051,7 @@
         <w:pStyle w:val="BodyText"/>
       </w:pPr>
       <w:r>
+        <w:lastRenderedPageBreak/>
         <w:t>This concatenation is performed in Script 02 (</w:t>
       </w:r>
       <w:r>
@@ -2714,7 +2715,6 @@
         <w:rPr>
           <w:rStyle w:val="VerbatimChar"/>
         </w:rPr>
-        <w:lastRenderedPageBreak/>
         <w:t>03_differential_expression.R →  seurat_output/differential_expression/</w:t>
       </w:r>
       <w:r>
@@ -2755,6 +2755,7 @@
     </w:p>
     <w:p>
       <w:r>
+        <w:lastRenderedPageBreak/>
         <w:pict w14:anchorId="6B81A9BC">
           <v:rect id="_x0000_i1029" style="width:0;height:1.5pt" o:hralign="center" o:hrstd="t" o:hr="t"/>
         </w:pict>
@@ -2923,7 +2924,7 @@
         <w:pStyle w:val="FirstParagraph"/>
       </w:pPr>
       <w:r>
-        <w:t>This script processes raw 10x Genomics H5 files through a seven-step pipeline, applying per-sample checkpointing to allow safe restarts without reprocessing completed samples.</w:t>
+        <w:t>This script processes raw 10x Genomics H5 files through a five-step pipeline (v9.0), applying per-sample checkpointing to allow safe restarts without reprocessing completed samples. All per-sample operations—SCEVAN CNA detection, DecontX ambient RNA correction, and DoubletFinder doublet removal—are completed before merging, so each checkpoint already contains clean, singlet-only, ambient-corrected cells.</w:t>
       </w:r>
     </w:p>
     <w:p>
@@ -3301,27 +3302,24 @@
               <w:pStyle w:val="Compact"/>
             </w:pPr>
             <w:r>
-              <w:t xml:space="preserve">Minimum genes per cell. Removes empty droplets </w:t>
-              <w:lastRenderedPageBreak/>
-              <w:t>and very low-quality cells.</w:t>
-            </w:r>
-          </w:p>
-        </w:tc>
-      </w:tr>
-      <w:tr>
-        <w:tc>
-          <w:tcPr>
-            <w:tcW w:w="0" w:type="auto"/>
-          </w:tcPr>
-          <w:p>
-            <w:pPr>
-              <w:pStyle w:val="Compact"/>
-            </w:pPr>
-            <w:r>
-              <w:rPr>
-                <w:rStyle w:val="VerbatimChar"/>
-              </w:rPr>
-              <w:lastRenderedPageBreak/>
+              <w:t>Minimum genes per cell. Removes empty droplets and very low-quality cells.</w:t>
+            </w:r>
+          </w:p>
+        </w:tc>
+      </w:tr>
+      <w:tr>
+        <w:tc>
+          <w:tcPr>
+            <w:tcW w:w="0" w:type="auto"/>
+          </w:tcPr>
+          <w:p>
+            <w:pPr>
+              <w:pStyle w:val="Compact"/>
+            </w:pPr>
+            <w:r>
+              <w:rPr>
+                <w:rStyle w:val="VerbatimChar"/>
+              </w:rPr>
               <w:t>PRE_MAX_MT_PERCENT</w:t>
             </w:r>
           </w:p>
@@ -3360,6 +3358,7 @@
       </w:pPr>
       <w:bookmarkStart w:id="21" w:name="Xebe442bfd6e8f6c079f27658ab85e48e33a09f0"/>
       <w:r>
+        <w:lastRenderedPageBreak/>
         <w:t>Post-Merge QC Parameters (applied after merging all samples)</w:t>
       </w:r>
       <w:bookmarkEnd w:id="21"/>
@@ -4116,9 +4115,97 @@
               <w:pStyle w:val="Compact"/>
             </w:pPr>
             <w:r>
-              <w:t xml:space="preserve">Highly variable genes used for PCA. Range: 2000–5000. Fewer HVGs can sometimes improve UMAP cluster </w:t>
+              <w:t>Highly variable genes used for PCA. Range: 2000–5000. Fewer HVGs can sometimes improve UMAP cluster separation.</w:t>
+            </w:r>
+          </w:p>
+        </w:tc>
+      </w:tr>
+      <w:tr>
+        <w:tc>
+          <w:tcPr>
+            <w:tcW w:w="0" w:type="auto"/>
+          </w:tcPr>
+          <w:p>
+            <w:pPr>
+              <w:pStyle w:val="Compact"/>
+            </w:pPr>
+            <w:r>
+              <w:rPr>
+                <w:rStyle w:val="VerbatimChar"/>
+              </w:rPr>
+              <w:t>N_PCS_TO_USE</w:t>
+            </w:r>
+          </w:p>
+        </w:tc>
+        <w:tc>
+          <w:tcPr>
+            <w:tcW w:w="0" w:type="auto"/>
+          </w:tcPr>
+          <w:p>
+            <w:pPr>
+              <w:pStyle w:val="Compact"/>
+            </w:pPr>
+            <w:r>
+              <w:t>50</w:t>
+            </w:r>
+          </w:p>
+        </w:tc>
+        <w:tc>
+          <w:tcPr>
+            <w:tcW w:w="0" w:type="auto"/>
+          </w:tcPr>
+          <w:p>
+            <w:pPr>
+              <w:pStyle w:val="Compact"/>
+            </w:pPr>
+            <w:r>
+              <w:t>Number of PCs used for graph construction and UMAP embedding (default and recommended).</w:t>
+            </w:r>
+          </w:p>
+        </w:tc>
+      </w:tr>
+      <w:tr>
+        <w:tc>
+          <w:tcPr>
+            <w:tcW w:w="0" w:type="auto"/>
+          </w:tcPr>
+          <w:p>
+            <w:pPr>
+              <w:pStyle w:val="Compact"/>
+            </w:pPr>
+            <w:r>
+              <w:rPr>
+                <w:rStyle w:val="VerbatimChar"/>
+              </w:rPr>
+              <w:t>CLUSTER_RESOLUTION</w:t>
+            </w:r>
+          </w:p>
+        </w:tc>
+        <w:tc>
+          <w:tcPr>
+            <w:tcW w:w="0" w:type="auto"/>
+          </w:tcPr>
+          <w:p>
+            <w:pPr>
+              <w:pStyle w:val="Compact"/>
+            </w:pPr>
+            <w:r>
+              <w:t>1.0</w:t>
+            </w:r>
+          </w:p>
+        </w:tc>
+        <w:tc>
+          <w:tcPr>
+            <w:tcW w:w="0" w:type="auto"/>
+          </w:tcPr>
+          <w:p>
+            <w:pPr>
+              <w:pStyle w:val="Compact"/>
+            </w:pPr>
+            <w:r>
+              <w:t xml:space="preserve">Leiden/Louvain clustering resolution. Higher values </w:t>
               <w:lastRenderedPageBreak/>
-              <w:t>separation.</w:t>
+              <w:t>produce more clusters. Tune after viewing the UMAP in Script 02.</w:t>
             </w:r>
           </w:p>
         </w:tc>
@@ -4137,94 +4224,6 @@
                 <w:rStyle w:val="VerbatimChar"/>
               </w:rPr>
               <w:lastRenderedPageBreak/>
-              <w:t>N_PCS_TO_USE</w:t>
-            </w:r>
-          </w:p>
-        </w:tc>
-        <w:tc>
-          <w:tcPr>
-            <w:tcW w:w="0" w:type="auto"/>
-          </w:tcPr>
-          <w:p>
-            <w:pPr>
-              <w:pStyle w:val="Compact"/>
-            </w:pPr>
-            <w:r>
-              <w:t>50</w:t>
-            </w:r>
-          </w:p>
-        </w:tc>
-        <w:tc>
-          <w:tcPr>
-            <w:tcW w:w="0" w:type="auto"/>
-          </w:tcPr>
-          <w:p>
-            <w:pPr>
-              <w:pStyle w:val="Compact"/>
-            </w:pPr>
-            <w:r>
-              <w:t>Number of PCs used for graph construction and UMAP embedding (default and recommended).</w:t>
-            </w:r>
-          </w:p>
-        </w:tc>
-      </w:tr>
-      <w:tr>
-        <w:tc>
-          <w:tcPr>
-            <w:tcW w:w="0" w:type="auto"/>
-          </w:tcPr>
-          <w:p>
-            <w:pPr>
-              <w:pStyle w:val="Compact"/>
-            </w:pPr>
-            <w:r>
-              <w:rPr>
-                <w:rStyle w:val="VerbatimChar"/>
-              </w:rPr>
-              <w:t>CLUSTER_RESOLUTION</w:t>
-            </w:r>
-          </w:p>
-        </w:tc>
-        <w:tc>
-          <w:tcPr>
-            <w:tcW w:w="0" w:type="auto"/>
-          </w:tcPr>
-          <w:p>
-            <w:pPr>
-              <w:pStyle w:val="Compact"/>
-            </w:pPr>
-            <w:r>
-              <w:t>1.0</w:t>
-            </w:r>
-          </w:p>
-        </w:tc>
-        <w:tc>
-          <w:tcPr>
-            <w:tcW w:w="0" w:type="auto"/>
-          </w:tcPr>
-          <w:p>
-            <w:pPr>
-              <w:pStyle w:val="Compact"/>
-            </w:pPr>
-            <w:r>
-              <w:t>Leiden/Louvain clustering resolution. Higher values produce more clusters. Tune after viewing the UMAP in Script 02.</w:t>
-            </w:r>
-          </w:p>
-        </w:tc>
-      </w:tr>
-      <w:tr>
-        <w:tc>
-          <w:tcPr>
-            <w:tcW w:w="0" w:type="auto"/>
-          </w:tcPr>
-          <w:p>
-            <w:pPr>
-              <w:pStyle w:val="Compact"/>
-            </w:pPr>
-            <w:r>
-              <w:rPr>
-                <w:rStyle w:val="VerbatimChar"/>
-              </w:rPr>
               <w:t>UMAP_N_NEIGHBORS</w:t>
             </w:r>
           </w:p>
@@ -4704,6 +4703,59 @@
               <w:rPr>
                 <w:rStyle w:val="VerbatimChar"/>
               </w:rPr>
+              <w:t>ROUND_DECONTX_COUNTS</w:t>
+            </w:r>
+          </w:p>
+        </w:tc>
+        <w:tc>
+          <w:tcPr>
+            <w:tcW w:w="0" w:type="auto"/>
+          </w:tcPr>
+          <w:p>
+            <w:pPr>
+              <w:pStyle w:val="Compact"/>
+            </w:pPr>
+            <w:r>
+              <w:t>FALSE</w:t>
+            </w:r>
+          </w:p>
+        </w:tc>
+        <w:tc>
+          <w:tcPr>
+            <w:tcW w:w="0" w:type="auto"/>
+          </w:tcPr>
+          <w:p>
+            <w:pPr>
+              <w:pStyle w:val="Compact"/>
+            </w:pPr>
+            <w:r>
+              <w:t xml:space="preserve">Round decontX corrected counts to the nearest integer. DecontX produces non-integer (fractional) count values by default. Set TRUE if downstream tools require integer matrices. Only active when </w:t>
+            </w:r>
+            <w:r>
+              <w:rPr>
+                <w:rStyle w:val="VerbatimChar"/>
+              </w:rPr>
+              <w:t>RUN_DECONTX</w:t>
+            </w:r>
+            <w:r>
+              <w:t xml:space="preserve"> is also TRUE. See the decontX vignette for details.</w:t>
+            </w:r>
+          </w:p>
+        </w:tc>
+      </w:tr>
+      <w:tr>
+        <w:tc>
+          <w:tcPr>
+            <w:tcW w:w="0" w:type="auto"/>
+          </w:tcPr>
+          <w:p>
+            <w:pPr>
+              <w:pStyle w:val="Compact"/>
+            </w:pPr>
+            <w:r>
+              <w:rPr>
+                <w:rStyle w:val="VerbatimChar"/>
+              </w:rPr>
               <w:t>RUN_SCEVAN</w:t>
             </w:r>
           </w:p>
@@ -4898,7 +4950,7 @@
               <w:pStyle w:val="Compact"/>
             </w:pPr>
             <w:r>
-              <w:t xml:space="preserve">Each sample is loaded from H5, optionally enriched with probe data, run through SCEVAN (if enabled), filtered with pre-merge QC, and saved as a </w:t>
+              <w:t xml:space="preserve">Each sample is processed through the full per-sample pipeline in order: (1) load H5 + optional probe data, (2) SCEVAN CNA detection on raw counts (if enabled), (3) pre-merge QC loose filters, (4) DecontX ambient RNA correction with optional integer rounding (if enabled), (5) DoubletFinder per-sample detection with constrained pK selection, rollback safeguard, and per-sample UMAP diagnostic, (6) doublet removal. The resulting clean, singlet-only, ambient-corrected object is saved as a </w:t>
             </w:r>
             <w:r>
               <w:rPr>
@@ -4907,7 +4959,7 @@
               <w:t>.rds</w:t>
             </w:r>
             <w:r>
-              <w:t xml:space="preserve"> checkpoint. Memory is fully freed after each sample. Only ONE sample occupies RAM at a time. On re-run, existing checkpoints are skipped automatically.</w:t>
+              <w:t xml:space="preserve"> checkpoint. Memory is fully freed after each sample. Only ONE sample occupies RAM at a time. On re-run, existing checkpoints are skipped automatically. The rollback log Excel is written after all samples complete.</w:t>
             </w:r>
           </w:p>
         </w:tc>
@@ -4948,7 +5000,7 @@
               <w:pStyle w:val="Compact"/>
             </w:pPr>
             <w:r>
-              <w:t>After all checkpoints are generated, samples are loaded sequentially into a named list for merging. SCEVAN metadata is already embedded in each checkpoint at this stage.</w:t>
+              <w:t>After all checkpoints are generated, samples are loaded sequentially into a named list for merging. Each checkpoint already contains clean, singlet-only cells with SCEVAN metadata, DecontX-corrected counts, and doublets removed.</w:t>
             </w:r>
           </w:p>
         </w:tc>
@@ -4989,7 +5041,7 @@
               <w:pStyle w:val="Compact"/>
             </w:pPr>
             <w:r>
-              <w:t xml:space="preserve">All per-sample objects are merged and Seurat v5 layers are joined via </w:t>
+              <w:t xml:space="preserve">All per-sample checkpoints are merged. BPCells on-disk matrix conversion and </w:t>
             </w:r>
             <w:r>
               <w:rPr>
@@ -4998,63 +5050,65 @@
               <w:t>JoinLayers()</w:t>
             </w:r>
             <w:r>
-              <w:t>.</w:t>
-            </w:r>
-          </w:p>
-        </w:tc>
-      </w:tr>
-      <w:tr>
-        <w:tc>
-          <w:tcPr>
-            <w:tcW w:w="0" w:type="auto"/>
-          </w:tcPr>
-          <w:p>
-            <w:pPr>
-              <w:pStyle w:val="Compact"/>
-            </w:pPr>
-            <w:r>
+              <w:t xml:space="preserve"> are deferred to Step 2.3 to prevent RAM exhaustion on large cohorts.</w:t>
+            </w:r>
+          </w:p>
+        </w:tc>
+      </w:tr>
+      <w:tr>
+        <w:tc>
+          <w:tcPr>
+            <w:tcW w:w="0" w:type="auto"/>
+          </w:tcPr>
+          <w:p>
+            <w:pPr>
+              <w:pStyle w:val="Compact"/>
+            </w:pPr>
+            <w:r>
+              <w:t>2.3</w:t>
+            </w:r>
+          </w:p>
+        </w:tc>
+        <w:tc>
+          <w:tcPr>
+            <w:tcW w:w="0" w:type="auto"/>
+          </w:tcPr>
+          <w:p>
+            <w:pPr>
+              <w:pStyle w:val="Compact"/>
+            </w:pPr>
+            <w:r>
+              <w:t>Post-Merge QC</w:t>
+            </w:r>
+          </w:p>
+        </w:tc>
+        <w:tc>
+          <w:tcPr>
+            <w:tcW w:w="0" w:type="auto"/>
+          </w:tcPr>
+          <w:p>
+            <w:pPr>
+              <w:pStyle w:val="Compact"/>
+            </w:pPr>
+            <w:r>
+              <w:t xml:space="preserve">Stringent cell-level and gene-level filters are applied. QC violin </w:t>
               <w:lastRenderedPageBreak/>
-              <w:t>2.3</w:t>
-            </w:r>
-          </w:p>
-        </w:tc>
-        <w:tc>
-          <w:tcPr>
-            <w:tcW w:w="0" w:type="auto"/>
-          </w:tcPr>
-          <w:p>
-            <w:pPr>
-              <w:pStyle w:val="Compact"/>
-            </w:pPr>
-            <w:r>
-              <w:t>Post-Merge QC</w:t>
-            </w:r>
-          </w:p>
-        </w:tc>
-        <w:tc>
-          <w:tcPr>
-            <w:tcW w:w="0" w:type="auto"/>
-          </w:tcPr>
-          <w:p>
-            <w:pPr>
-              <w:pStyle w:val="Compact"/>
-            </w:pPr>
-            <w:r>
-              <w:t>Stringent cell-level and gene-level filters are applied. QC violin plots are saved before and after filtering.</w:t>
-            </w:r>
-          </w:p>
-        </w:tc>
-      </w:tr>
-      <w:tr>
-        <w:tc>
-          <w:tcPr>
-            <w:tcW w:w="0" w:type="auto"/>
-          </w:tcPr>
-          <w:p>
-            <w:pPr>
-              <w:pStyle w:val="Compact"/>
-            </w:pPr>
-            <w:r>
+              <w:t>plots are saved before and after filtering.</w:t>
+            </w:r>
+          </w:p>
+        </w:tc>
+      </w:tr>
+      <w:tr>
+        <w:tc>
+          <w:tcPr>
+            <w:tcW w:w="0" w:type="auto"/>
+          </w:tcPr>
+          <w:p>
+            <w:pPr>
+              <w:pStyle w:val="Compact"/>
+            </w:pPr>
+            <w:r>
+              <w:lastRenderedPageBreak/>
               <w:t>2.4</w:t>
             </w:r>
           </w:p>
@@ -5068,20 +5122,20 @@
               <w:pStyle w:val="Compact"/>
             </w:pPr>
             <w:r>
-              <w:t>Doublet Detection</w:t>
-            </w:r>
-          </w:p>
-        </w:tc>
-        <w:tc>
-          <w:tcPr>
-            <w:tcW w:w="0" w:type="auto"/>
-          </w:tcPr>
-          <w:p>
-            <w:pPr>
-              <w:pStyle w:val="Compact"/>
-            </w:pPr>
-            <w:r>
-              <w:t>DoubletFinder runs per-sample on the merged object (by splitting on SampleID). Includes pK selection diagnostic plots and the rollback safeguard. A rollback log Excel file is saved.</w:t>
+              <w:t>Normalization, Integration, Clustering</w:t>
+            </w:r>
+          </w:p>
+        </w:tc>
+        <w:tc>
+          <w:tcPr>
+            <w:tcW w:w="0" w:type="auto"/>
+          </w:tcPr>
+          <w:p>
+            <w:pPr>
+              <w:pStyle w:val="Compact"/>
+            </w:pPr>
+            <w:r>
+              <w:t>Per-layer normalization, HVG selection, scaling, and PCA. Two parallel tracks: standard PCA (no batch correction, Track A) and Harmony-corrected (Track B, group by SampleID via IntegrateLayers). Both UMAPs and cluster assignments (Leiden algorithm) are saved in the object. Layers are re-joined to dgCMatrix for downstream analysis.</w:t>
             </w:r>
           </w:p>
         </w:tc>
@@ -5109,88 +5163,6 @@
               <w:pStyle w:val="Compact"/>
             </w:pPr>
             <w:r>
-              <w:t>DecontX (Optional)</w:t>
-            </w:r>
-          </w:p>
-        </w:tc>
-        <w:tc>
-          <w:tcPr>
-            <w:tcW w:w="0" w:type="auto"/>
-          </w:tcPr>
-          <w:p>
-            <w:pPr>
-              <w:pStyle w:val="Compact"/>
-            </w:pPr>
-            <w:r>
-              <w:t>Replaces raw counts with decontaminated counts. QC metrics are recalculated and filters re-applied after correction.</w:t>
-            </w:r>
-          </w:p>
-        </w:tc>
-      </w:tr>
-      <w:tr>
-        <w:tc>
-          <w:tcPr>
-            <w:tcW w:w="0" w:type="auto"/>
-          </w:tcPr>
-          <w:p>
-            <w:pPr>
-              <w:pStyle w:val="Compact"/>
-            </w:pPr>
-            <w:r>
-              <w:t>2.6</w:t>
-            </w:r>
-          </w:p>
-        </w:tc>
-        <w:tc>
-          <w:tcPr>
-            <w:tcW w:w="0" w:type="auto"/>
-          </w:tcPr>
-          <w:p>
-            <w:pPr>
-              <w:pStyle w:val="Compact"/>
-            </w:pPr>
-            <w:r>
-              <w:t>Normalization, Integration, Clustering</w:t>
-            </w:r>
-          </w:p>
-        </w:tc>
-        <w:tc>
-          <w:tcPr>
-            <w:tcW w:w="0" w:type="auto"/>
-          </w:tcPr>
-          <w:p>
-            <w:pPr>
-              <w:pStyle w:val="Compact"/>
-            </w:pPr>
-            <w:r>
-              <w:t>Two parallel tracks: standard PCA (no batch correction) and Harmony-corrected (group by SampleID). Both UMAPs and cluster assignments are saved in the object.</w:t>
-            </w:r>
-          </w:p>
-        </w:tc>
-      </w:tr>
-      <w:tr>
-        <w:tc>
-          <w:tcPr>
-            <w:tcW w:w="0" w:type="auto"/>
-          </w:tcPr>
-          <w:p>
-            <w:pPr>
-              <w:pStyle w:val="Compact"/>
-            </w:pPr>
-            <w:r>
-              <w:t>2.7</w:t>
-            </w:r>
-          </w:p>
-        </w:tc>
-        <w:tc>
-          <w:tcPr>
-            <w:tcW w:w="0" w:type="auto"/>
-          </w:tcPr>
-          <w:p>
-            <w:pPr>
-              <w:pStyle w:val="Compact"/>
-            </w:pPr>
-            <w:r>
               <w:t>Save Processed Object</w:t>
             </w:r>
           </w:p>
@@ -5204,16 +5176,13 @@
               <w:pStyle w:val="Compact"/>
             </w:pPr>
             <w:r>
-              <w:t xml:space="preserve">Saves </w:t>
-            </w:r>
-            <w:r>
               <w:rPr>
                 <w:rStyle w:val="VerbatimChar"/>
               </w:rPr>
               <w:t>&lt;PROJECT&gt;_processed_for_annotation.rds</w:t>
             </w:r>
             <w:r>
-              <w:t xml:space="preserve"> for Script 02.</w:t>
+              <w:t xml:space="preserve"> is written for Script 02.</w:t>
             </w:r>
           </w:p>
         </w:tc>
@@ -5350,20 +5319,20 @@
               <w:rPr>
                 <w:rStyle w:val="VerbatimChar"/>
               </w:rPr>
-              <w:t>01c_DIAGNOSTIC_doublet_visualization.png</w:t>
-            </w:r>
-          </w:p>
-        </w:tc>
-        <w:tc>
-          <w:tcPr>
-            <w:tcW w:w="0" w:type="auto"/>
-          </w:tcPr>
-          <w:p>
-            <w:pPr>
-              <w:pStyle w:val="Compact"/>
-            </w:pPr>
-            <w:r>
-              <w:t>UMAP showing doublets before removal.</w:t>
+              <w:t>scevan_per_sample_results/&lt;sample&gt;/&lt;sample&gt;_doublet_visualization.png</w:t>
+            </w:r>
+          </w:p>
+        </w:tc>
+        <w:tc>
+          <w:tcPr>
+            <w:tcW w:w="0" w:type="auto"/>
+          </w:tcPr>
+          <w:p>
+            <w:pPr>
+              <w:pStyle w:val="Compact"/>
+            </w:pPr>
+            <w:r>
+              <w:t>Per-sample UMAP showing doublets before removal (one file per sample, saved in its checkpoint directory).</w:t>
             </w:r>
           </w:p>
         </w:tc>
@@ -5412,20 +5381,20 @@
               <w:rPr>
                 <w:rStyle w:val="VerbatimChar"/>
               </w:rPr>
-              <w:t>doublet_finder_plots/&lt;sample&gt;_pk_plot.png</w:t>
-            </w:r>
-          </w:p>
-        </w:tc>
-        <w:tc>
-          <w:tcPr>
-            <w:tcW w:w="0" w:type="auto"/>
-          </w:tcPr>
-          <w:p>
-            <w:pPr>
-              <w:pStyle w:val="Compact"/>
-            </w:pPr>
-            <w:r>
-              <w:t>pK selection diagnostic plot per sample.</w:t>
+              <w:t>scevan_per_sample_results/&lt;sample&gt;/&lt;sample&gt;_pk_plot.png</w:t>
+            </w:r>
+          </w:p>
+        </w:tc>
+        <w:tc>
+          <w:tcPr>
+            <w:tcW w:w="0" w:type="auto"/>
+          </w:tcPr>
+          <w:p>
+            <w:pPr>
+              <w:pStyle w:val="Compact"/>
+            </w:pPr>
+            <w:r>
+              <w:t>pK selection diagnostic plot per sample (saved alongside checkpoint in SCEVAN_DIR).</w:t>
             </w:r>
           </w:p>
         </w:tc>
@@ -5583,7 +5552,6 @@
       </w:pPr>
       <w:bookmarkStart w:id="30" w:name="the-weighted-pre-scoring-algorithm"/>
       <w:r>
-        <w:lastRenderedPageBreak/>
         <w:t>7.2 The Weighted Pre-Scoring Algorithm</w:t>
       </w:r>
       <w:bookmarkEnd w:id="30"/>
@@ -5613,6 +5581,7 @@
         <w:rPr>
           <w:b/>
         </w:rPr>
+        <w:lastRenderedPageBreak/>
         <w:t>Algorithm steps:</w:t>
       </w:r>
     </w:p>
@@ -6350,9 +6319,109 @@
               <w:pStyle w:val="Compact"/>
             </w:pPr>
             <w:r>
-              <w:t xml:space="preserve">Run the full sub-clustering workflow for the selected </w:t>
+              <w:t>Run the full sub-clustering workflow for the selected cell type.</w:t>
+            </w:r>
+          </w:p>
+        </w:tc>
+      </w:tr>
+      <w:tr>
+        <w:tc>
+          <w:tcPr>
+            <w:tcW w:w="0" w:type="auto"/>
+          </w:tcPr>
+          <w:p>
+            <w:pPr>
+              <w:pStyle w:val="Compact"/>
+            </w:pPr>
+            <w:r>
+              <w:rPr>
+                <w:rStyle w:val="VerbatimChar"/>
+              </w:rPr>
+              <w:t>SUBCLUSTER_RESOLUTION</w:t>
+            </w:r>
+          </w:p>
+        </w:tc>
+        <w:tc>
+          <w:tcPr>
+            <w:tcW w:w="0" w:type="auto"/>
+          </w:tcPr>
+          <w:p>
+            <w:pPr>
+              <w:pStyle w:val="Compact"/>
+            </w:pPr>
+            <w:r>
+              <w:t>NULL</w:t>
+            </w:r>
+          </w:p>
+        </w:tc>
+        <w:tc>
+          <w:tcPr>
+            <w:tcW w:w="0" w:type="auto"/>
+          </w:tcPr>
+          <w:p>
+            <w:pPr>
+              <w:pStyle w:val="Compact"/>
+            </w:pPr>
+            <w:r>
+              <w:t>Set to NULL to auto-read from the CSV. Override to use a custom resolution.</w:t>
+            </w:r>
+          </w:p>
+        </w:tc>
+      </w:tr>
+      <w:tr>
+        <w:tc>
+          <w:tcPr>
+            <w:tcW w:w="0" w:type="auto"/>
+          </w:tcPr>
+          <w:p>
+            <w:pPr>
+              <w:pStyle w:val="Compact"/>
+            </w:pPr>
+            <w:r>
+              <w:rPr>
+                <w:rStyle w:val="VerbatimChar"/>
+              </w:rPr>
+              <w:t>ADDITIONAL_GROUPS_TO_PLOT</w:t>
+            </w:r>
+          </w:p>
+        </w:tc>
+        <w:tc>
+          <w:tcPr>
+            <w:tcW w:w="0" w:type="auto"/>
+          </w:tcPr>
+          <w:p>
+            <w:pPr>
+              <w:pStyle w:val="Compact"/>
+            </w:pPr>
+            <w:r>
+              <w:rPr>
+                <w:rStyle w:val="VerbatimChar"/>
+              </w:rPr>
+              <w:t>c("Condition")</w:t>
+            </w:r>
+          </w:p>
+        </w:tc>
+        <w:tc>
+          <w:tcPr>
+            <w:tcW w:w="0" w:type="auto"/>
+          </w:tcPr>
+          <w:p>
+            <w:pPr>
+              <w:pStyle w:val="Compact"/>
+            </w:pPr>
+            <w:r>
+              <w:t xml:space="preserve">Metadata columns for </w:t>
               <w:lastRenderedPageBreak/>
-              <w:t>cell type.</w:t>
+              <w:t xml:space="preserve">compositional proportion plots. Combined columns (e.g., </w:t>
+            </w:r>
+            <w:r>
+              <w:rPr>
+                <w:rStyle w:val="VerbatimChar"/>
+              </w:rPr>
+              <w:t>"Genotype_Diet"</w:t>
+            </w:r>
+            <w:r>
+              <w:t>) are auto-created if component columns exist.</w:t>
             </w:r>
           </w:p>
         </w:tc>
@@ -6371,106 +6440,6 @@
                 <w:rStyle w:val="VerbatimChar"/>
               </w:rPr>
               <w:lastRenderedPageBreak/>
-              <w:t>SUBCLUSTER_RESOLUTION</w:t>
-            </w:r>
-          </w:p>
-        </w:tc>
-        <w:tc>
-          <w:tcPr>
-            <w:tcW w:w="0" w:type="auto"/>
-          </w:tcPr>
-          <w:p>
-            <w:pPr>
-              <w:pStyle w:val="Compact"/>
-            </w:pPr>
-            <w:r>
-              <w:t>NULL</w:t>
-            </w:r>
-          </w:p>
-        </w:tc>
-        <w:tc>
-          <w:tcPr>
-            <w:tcW w:w="0" w:type="auto"/>
-          </w:tcPr>
-          <w:p>
-            <w:pPr>
-              <w:pStyle w:val="Compact"/>
-            </w:pPr>
-            <w:r>
-              <w:t>Set to NULL to auto-read from the CSV. Override to use a custom resolution.</w:t>
-            </w:r>
-          </w:p>
-        </w:tc>
-      </w:tr>
-      <w:tr>
-        <w:tc>
-          <w:tcPr>
-            <w:tcW w:w="0" w:type="auto"/>
-          </w:tcPr>
-          <w:p>
-            <w:pPr>
-              <w:pStyle w:val="Compact"/>
-            </w:pPr>
-            <w:r>
-              <w:rPr>
-                <w:rStyle w:val="VerbatimChar"/>
-              </w:rPr>
-              <w:t>ADDITIONAL_GROUPS_TO_PLOT</w:t>
-            </w:r>
-          </w:p>
-        </w:tc>
-        <w:tc>
-          <w:tcPr>
-            <w:tcW w:w="0" w:type="auto"/>
-          </w:tcPr>
-          <w:p>
-            <w:pPr>
-              <w:pStyle w:val="Compact"/>
-            </w:pPr>
-            <w:r>
-              <w:rPr>
-                <w:rStyle w:val="VerbatimChar"/>
-              </w:rPr>
-              <w:t>c("Condition")</w:t>
-            </w:r>
-          </w:p>
-        </w:tc>
-        <w:tc>
-          <w:tcPr>
-            <w:tcW w:w="0" w:type="auto"/>
-          </w:tcPr>
-          <w:p>
-            <w:pPr>
-              <w:pStyle w:val="Compact"/>
-            </w:pPr>
-            <w:r>
-              <w:t xml:space="preserve">Metadata columns for compositional proportion plots. Combined columns (e.g., </w:t>
-            </w:r>
-            <w:r>
-              <w:rPr>
-                <w:rStyle w:val="VerbatimChar"/>
-              </w:rPr>
-              <w:t>"Genotype_Diet"</w:t>
-            </w:r>
-            <w:r>
-              <w:t>) are auto-created if component columns exist.</w:t>
-            </w:r>
-          </w:p>
-        </w:tc>
-      </w:tr>
-      <w:tr>
-        <w:tc>
-          <w:tcPr>
-            <w:tcW w:w="0" w:type="auto"/>
-          </w:tcPr>
-          <w:p>
-            <w:pPr>
-              <w:pStyle w:val="Compact"/>
-            </w:pPr>
-            <w:r>
-              <w:rPr>
-                <w:rStyle w:val="VerbatimChar"/>
-              </w:rPr>
               <w:t>COMPARISON_X_AXIS</w:t>
             </w:r>
           </w:p>
@@ -6912,118 +6881,120 @@
               <w:rPr>
                 <w:rStyle w:val="VerbatimChar"/>
               </w:rPr>
+              <w:t>markers</w:t>
+            </w:r>
+          </w:p>
+        </w:tc>
+        <w:tc>
+          <w:tcPr>
+            <w:tcW w:w="0" w:type="auto"/>
+          </w:tcPr>
+          <w:p>
+            <w:pPr>
+              <w:pStyle w:val="Compact"/>
+            </w:pPr>
+            <w:r>
+              <w:t xml:space="preserve">Pipe-separated gene symbols for weighted scoring (e.g., </w:t>
+            </w:r>
+            <w:r>
+              <w:rPr>
+                <w:rStyle w:val="VerbatimChar"/>
+              </w:rPr>
+              <w:t>"Foxp3|Il2ra|Ikzf2|Ctla4"</w:t>
+            </w:r>
+            <w:r>
+              <w:t>).</w:t>
+            </w:r>
+          </w:p>
+        </w:tc>
+      </w:tr>
+      <w:tr>
+        <w:tc>
+          <w:tcPr>
+            <w:tcW w:w="0" w:type="auto"/>
+          </w:tcPr>
+          <w:p>
+            <w:pPr>
+              <w:pStyle w:val="Compact"/>
+            </w:pPr>
+            <w:r>
+              <w:rPr>
+                <w:rStyle w:val="VerbatimChar"/>
+              </w:rPr>
+              <w:t>dotplot_markers</w:t>
+            </w:r>
+          </w:p>
+        </w:tc>
+        <w:tc>
+          <w:tcPr>
+            <w:tcW w:w="0" w:type="auto"/>
+          </w:tcPr>
+          <w:p>
+            <w:pPr>
+              <w:pStyle w:val="Compact"/>
+            </w:pPr>
+            <w:r>
+              <w:t xml:space="preserve">Pipe-separated genes for the DotPlot visualization. May be a curated subset of </w:t>
+            </w:r>
+            <w:r>
+              <w:rPr>
+                <w:rStyle w:val="VerbatimChar"/>
+              </w:rPr>
+              <w:t>markers</w:t>
+            </w:r>
+            <w:r>
+              <w:t>.</w:t>
+            </w:r>
+          </w:p>
+        </w:tc>
+      </w:tr>
+      <w:tr>
+        <w:tc>
+          <w:tcPr>
+            <w:tcW w:w="0" w:type="auto"/>
+          </w:tcPr>
+          <w:p>
+            <w:pPr>
+              <w:pStyle w:val="Compact"/>
+            </w:pPr>
+            <w:r>
+              <w:rPr>
+                <w:rStyle w:val="VerbatimChar"/>
+              </w:rPr>
+              <w:t>subcluster_resolution</w:t>
+            </w:r>
+          </w:p>
+        </w:tc>
+        <w:tc>
+          <w:tcPr>
+            <w:tcW w:w="0" w:type="auto"/>
+          </w:tcPr>
+          <w:p>
+            <w:pPr>
+              <w:pStyle w:val="Compact"/>
+            </w:pPr>
+            <w:r>
+              <w:t xml:space="preserve">Suggested Leiden clustering resolution for sub-typing this cell </w:t>
               <w:lastRenderedPageBreak/>
-              <w:t>markers</w:t>
-            </w:r>
-          </w:p>
-        </w:tc>
-        <w:tc>
-          <w:tcPr>
-            <w:tcW w:w="0" w:type="auto"/>
-          </w:tcPr>
-          <w:p>
-            <w:pPr>
-              <w:pStyle w:val="Compact"/>
-            </w:pPr>
-            <w:r>
-              <w:t xml:space="preserve">Pipe-separated gene symbols for weighted scoring (e.g., </w:t>
-            </w:r>
-            <w:r>
-              <w:rPr>
-                <w:rStyle w:val="VerbatimChar"/>
-              </w:rPr>
-              <w:t>"Foxp3|Il2ra|Ikzf2|Ctla4"</w:t>
-            </w:r>
-            <w:r>
-              <w:t>).</w:t>
-            </w:r>
-          </w:p>
-        </w:tc>
-      </w:tr>
-      <w:tr>
-        <w:tc>
-          <w:tcPr>
-            <w:tcW w:w="0" w:type="auto"/>
-          </w:tcPr>
-          <w:p>
-            <w:pPr>
-              <w:pStyle w:val="Compact"/>
-            </w:pPr>
-            <w:r>
-              <w:rPr>
-                <w:rStyle w:val="VerbatimChar"/>
-              </w:rPr>
-              <w:t>dotplot_markers</w:t>
-            </w:r>
-          </w:p>
-        </w:tc>
-        <w:tc>
-          <w:tcPr>
-            <w:tcW w:w="0" w:type="auto"/>
-          </w:tcPr>
-          <w:p>
-            <w:pPr>
-              <w:pStyle w:val="Compact"/>
-            </w:pPr>
-            <w:r>
-              <w:t xml:space="preserve">Pipe-separated genes for the DotPlot visualization. May be a curated subset of </w:t>
-            </w:r>
-            <w:r>
-              <w:rPr>
-                <w:rStyle w:val="VerbatimChar"/>
-              </w:rPr>
-              <w:t>markers</w:t>
-            </w:r>
-            <w:r>
-              <w:t>.</w:t>
-            </w:r>
-          </w:p>
-        </w:tc>
-      </w:tr>
-      <w:tr>
-        <w:tc>
-          <w:tcPr>
-            <w:tcW w:w="0" w:type="auto"/>
-          </w:tcPr>
-          <w:p>
-            <w:pPr>
-              <w:pStyle w:val="Compact"/>
-            </w:pPr>
-            <w:r>
-              <w:rPr>
-                <w:rStyle w:val="VerbatimChar"/>
-              </w:rPr>
-              <w:t>subcluster_resolution</w:t>
-            </w:r>
-          </w:p>
-        </w:tc>
-        <w:tc>
-          <w:tcPr>
-            <w:tcW w:w="0" w:type="auto"/>
-          </w:tcPr>
-          <w:p>
-            <w:pPr>
-              <w:pStyle w:val="Compact"/>
-            </w:pPr>
-            <w:r>
-              <w:t>Suggested Leiden clustering resolution for sub-typing this cell population. Empty for broad rows.</w:t>
-            </w:r>
-          </w:p>
-        </w:tc>
-      </w:tr>
-      <w:tr>
-        <w:tc>
-          <w:tcPr>
-            <w:tcW w:w="0" w:type="auto"/>
-          </w:tcPr>
-          <w:p>
-            <w:pPr>
-              <w:pStyle w:val="Compact"/>
-            </w:pPr>
-            <w:r>
-              <w:rPr>
-                <w:rStyle w:val="VerbatimChar"/>
-              </w:rPr>
+              <w:t>population. Empty for broad rows.</w:t>
+            </w:r>
+          </w:p>
+        </w:tc>
+      </w:tr>
+      <w:tr>
+        <w:tc>
+          <w:tcPr>
+            <w:tcW w:w="0" w:type="auto"/>
+          </w:tcPr>
+          <w:p>
+            <w:pPr>
+              <w:pStyle w:val="Compact"/>
+            </w:pPr>
+            <w:r>
+              <w:rPr>
+                <w:rStyle w:val="VerbatimChar"/>
+              </w:rPr>
+              <w:lastRenderedPageBreak/>
               <w:t>description</w:t>
             </w:r>
           </w:p>
@@ -7575,9 +7546,7 @@
         <w:pStyle w:val="FirstParagraph"/>
       </w:pPr>
       <w:r>
-        <w:t xml:space="preserve">Runs differential gene expression (DGE) and differential variability (DV) analysis across user-specified cell types and group comparisons. Four independent modes can be enabled </w:t>
-        <w:lastRenderedPageBreak/>
-        <w:t>in any combination. No DESeq2 pseudo-bulk is included by design — exploratory per-cell Wilcoxon (Mode A) and SplineDV-based DV analysis (Mode D) are the two primary statistical approaches.</w:t>
+        <w:t>Runs differential gene expression (DGE) and differential variability (DV) analysis across user-specified cell types and group comparisons. Four independent modes can be enabled in any combination. No DESeq2 pseudo-bulk is included by design — exploratory per-cell Wilcoxon (Mode A) and SplineDV-based DV analysis (Mode D) are the two primary statistical approaches.</w:t>
       </w:r>
     </w:p>
     <w:p>
@@ -7586,6 +7555,7 @@
       </w:pPr>
       <w:bookmarkStart w:id="37" w:name="configuration-parameters-2"/>
       <w:r>
+        <w:lastRenderedPageBreak/>
         <w:t>8.2 Configuration Parameters</w:t>
       </w:r>
       <w:bookmarkEnd w:id="37"/>
@@ -7598,8 +7568,8 @@
       </w:tblPr>
       <w:tblGrid>
         <w:gridCol w:w="2999"/>
-        <w:gridCol w:w="1547"/>
-        <w:gridCol w:w="5030"/>
+        <w:gridCol w:w="1694"/>
+        <w:gridCol w:w="4883"/>
       </w:tblGrid>
       <w:tr>
         <w:tc>
@@ -8276,7 +8246,7 @@
               <w:rPr>
                 <w:rStyle w:val="VerbatimChar"/>
               </w:rPr>
-              <w:t xml:space="preserve">"Mus musculus"</w:t>
+              <w:t>"Mus musculus"</w:t>
             </w:r>
           </w:p>
         </w:tc>
@@ -8481,24 +8451,27 @@
               <w:pStyle w:val="Compact"/>
             </w:pPr>
             <w:r>
-              <w:t>Minimum number of genes a pathway must contain to be tested in GSEA.</w:t>
-            </w:r>
-          </w:p>
-        </w:tc>
-      </w:tr>
-      <w:tr>
-        <w:tc>
-          <w:tcPr>
-            <w:tcW w:w="0" w:type="auto"/>
-          </w:tcPr>
-          <w:p>
-            <w:pPr>
-              <w:pStyle w:val="Compact"/>
-            </w:pPr>
-            <w:r>
-              <w:rPr>
-                <w:rStyle w:val="VerbatimChar"/>
-              </w:rPr>
+              <w:t xml:space="preserve">Minimum number of genes a pathway must </w:t>
+              <w:lastRenderedPageBreak/>
+              <w:t>contain to be tested in GSEA.</w:t>
+            </w:r>
+          </w:p>
+        </w:tc>
+      </w:tr>
+      <w:tr>
+        <w:tc>
+          <w:tcPr>
+            <w:tcW w:w="0" w:type="auto"/>
+          </w:tcPr>
+          <w:p>
+            <w:pPr>
+              <w:pStyle w:val="Compact"/>
+            </w:pPr>
+            <w:r>
+              <w:rPr>
+                <w:rStyle w:val="VerbatimChar"/>
+              </w:rPr>
+              <w:lastRenderedPageBreak/>
               <w:t>GSEA_MAX_SIZE</w:t>
             </w:r>
           </w:p>
@@ -8688,7 +8661,7 @@
               <w:pStyle w:val="Compact"/>
             </w:pPr>
             <w:r>
-              <w:t xml:space="preserve">GO BP 2025, GO MF 2025, KEGG 2026</w:t>
+              <w:t>GO BP 2025, GO MF 2025, KEGG 2026</w:t>
             </w:r>
           </w:p>
         </w:tc>
@@ -8754,7 +8727,7 @@
               <w:pStyle w:val="Compact"/>
             </w:pPr>
             <w:r>
-              <w:t xml:space="preserve">Number of top genes submitted to Enrichr ORA per list. DE lists require padj &lt; DE_PADJ_THRESH (0.05); the top N significant genes are then ranked by effect size. DV list uses no significance cutoff (all DV-tested genes ranked by padj). Tunable — increase for more coverage, decrease for tighter lists.</w:t>
+              <w:t>Number of top genes submitted to Enrichr ORA per list. DE lists require padj &lt; DE_PADJ_THRESH (0.05); the top N significant genes are then ranked by effect size. DV list uses no significance cutoff (all DV-tested genes ranked by padj). Tunable — increase for more coverage, decrease for tighter lists.</w:t>
             </w:r>
           </w:p>
         </w:tc>
@@ -8916,7 +8889,6 @@
       </w:pPr>
       <w:bookmarkStart w:id="38" w:name="analysis-modes"/>
       <w:r>
-        <w:lastRenderedPageBreak/>
         <w:t>8.3 Analysis Modes</w:t>
       </w:r>
       <w:bookmarkEnd w:id="38"/>
@@ -8968,6 +8940,7 @@
       </w:pPr>
       <w:bookmarkStart w:id="40" w:name="mode-b-cell-type-marker-genes"/>
       <w:r>
+        <w:lastRenderedPageBreak/>
         <w:t>Mode B — Cell-Type Marker Genes</w:t>
       </w:r>
       <w:bookmarkEnd w:id="40"/>
@@ -9494,6 +9467,7 @@
         <w:rPr>
           <w:rStyle w:val="VerbatimChar"/>
         </w:rPr>
+        <w:lastRenderedPageBreak/>
         <w:t>ENRICHR_TOP_N_GENES</w:t>
       </w:r>
       <w:r>
@@ -9777,58 +9751,61 @@
               <w:pStyle w:val="Compact"/>
             </w:pPr>
             <w:r>
-              <w:t xml:space="preserve">Full SplineDV output with gene-level DV </w:t>
+              <w:t>Full SplineDV output with gene-level DV statistics.</w:t>
+            </w:r>
+          </w:p>
+        </w:tc>
+      </w:tr>
+      <w:tr>
+        <w:tc>
+          <w:tcPr>
+            <w:tcW w:w="0" w:type="auto"/>
+          </w:tcPr>
+          <w:p>
+            <w:pPr>
+              <w:pStyle w:val="Compact"/>
+            </w:pPr>
+            <w:r>
+              <w:rPr>
+                <w:rStyle w:val="VerbatimChar"/>
+              </w:rPr>
+              <w:t>ModeD_SplineDV_&lt;G1&gt;_vs_&lt;G2&gt;/&lt;CellType&gt;/&lt;CellType&gt;_DV_DE_overlap_ge</w:t>
               <w:lastRenderedPageBreak/>
-              <w:t>statistics.</w:t>
-            </w:r>
-          </w:p>
-        </w:tc>
-      </w:tr>
-      <w:tr>
-        <w:tc>
-          <w:tcPr>
-            <w:tcW w:w="0" w:type="auto"/>
-          </w:tcPr>
-          <w:p>
-            <w:pPr>
-              <w:pStyle w:val="Compact"/>
-            </w:pPr>
-            <w:r>
-              <w:rPr>
-                <w:rStyle w:val="VerbatimChar"/>
-              </w:rPr>
+              <w:t>nes.csv</w:t>
+            </w:r>
+          </w:p>
+        </w:tc>
+        <w:tc>
+          <w:tcPr>
+            <w:tcW w:w="0" w:type="auto"/>
+          </w:tcPr>
+          <w:p>
+            <w:pPr>
+              <w:pStyle w:val="Compact"/>
+            </w:pPr>
+            <w:r>
               <w:lastRenderedPageBreak/>
-              <w:t>ModeD_SplineDV_&lt;G1&gt;_vs_&lt;G2&gt;/&lt;CellType&gt;/&lt;CellType&gt;_DV_DE_overlap_genes.csv</w:t>
-            </w:r>
-          </w:p>
-        </w:tc>
-        <w:tc>
-          <w:tcPr>
-            <w:tcW w:w="0" w:type="auto"/>
-          </w:tcPr>
-          <w:p>
-            <w:pPr>
-              <w:pStyle w:val="Compact"/>
-            </w:pPr>
-            <w:r>
-              <w:t>Overlap gene table with DV and DE statistics side-by-side.</w:t>
-            </w:r>
-          </w:p>
-        </w:tc>
-      </w:tr>
-      <w:tr>
-        <w:tc>
-          <w:tcPr>
-            <w:tcW w:w="0" w:type="auto"/>
-          </w:tcPr>
-          <w:p>
-            <w:pPr>
-              <w:pStyle w:val="Compact"/>
-            </w:pPr>
-            <w:r>
-              <w:rPr>
-                <w:rStyle w:val="VerbatimChar"/>
-              </w:rPr>
+              <w:t xml:space="preserve">Overlap </w:t>
+              <w:lastRenderedPageBreak/>
+              <w:t>gene table with DV and DE statistics side-by-side.</w:t>
+            </w:r>
+          </w:p>
+        </w:tc>
+      </w:tr>
+      <w:tr>
+        <w:tc>
+          <w:tcPr>
+            <w:tcW w:w="0" w:type="auto"/>
+          </w:tcPr>
+          <w:p>
+            <w:pPr>
+              <w:pStyle w:val="Compact"/>
+            </w:pPr>
+            <w:r>
+              <w:rPr>
+                <w:rStyle w:val="VerbatimChar"/>
+              </w:rPr>
+              <w:lastRenderedPageBreak/>
               <w:t>ModeD_SplineDV_&lt;G1&gt;_vs_&lt;G2&gt;/&lt;CellType&gt;/&lt;CellType&gt;_ORA_DV_UpDE.csv</w:t>
             </w:r>
           </w:p>
@@ -10119,54 +10096,54 @@
               <w:rPr>
                 <w:rStyle w:val="VerbatimChar"/>
               </w:rPr>
+              <w:t>SUBTYPE_COLUMN</w:t>
+            </w:r>
+          </w:p>
+        </w:tc>
+        <w:tc>
+          <w:tcPr>
+            <w:tcW w:w="0" w:type="auto"/>
+          </w:tcPr>
+          <w:p>
+            <w:pPr>
+              <w:pStyle w:val="Compact"/>
+            </w:pPr>
+            <w:r>
+              <w:rPr>
+                <w:rStyle w:val="VerbatimChar"/>
+              </w:rPr>
+              <w:t>"sub_cell_types"</w:t>
+            </w:r>
+          </w:p>
+        </w:tc>
+        <w:tc>
+          <w:tcPr>
+            <w:tcW w:w="0" w:type="auto"/>
+          </w:tcPr>
+          <w:p>
+            <w:pPr>
+              <w:pStyle w:val="Compact"/>
+            </w:pPr>
+            <w:r>
+              <w:t>Metadata column used as facets in comparison plots.</w:t>
+            </w:r>
+          </w:p>
+        </w:tc>
+      </w:tr>
+      <w:tr>
+        <w:tc>
+          <w:tcPr>
+            <w:tcW w:w="0" w:type="auto"/>
+          </w:tcPr>
+          <w:p>
+            <w:pPr>
+              <w:pStyle w:val="Compact"/>
+            </w:pPr>
+            <w:r>
+              <w:rPr>
+                <w:rStyle w:val="VerbatimChar"/>
+              </w:rPr>
               <w:lastRenderedPageBreak/>
-              <w:t>SUBTYPE_COLUMN</w:t>
-            </w:r>
-          </w:p>
-        </w:tc>
-        <w:tc>
-          <w:tcPr>
-            <w:tcW w:w="0" w:type="auto"/>
-          </w:tcPr>
-          <w:p>
-            <w:pPr>
-              <w:pStyle w:val="Compact"/>
-            </w:pPr>
-            <w:r>
-              <w:rPr>
-                <w:rStyle w:val="VerbatimChar"/>
-              </w:rPr>
-              <w:t>"sub_cell_types"</w:t>
-            </w:r>
-          </w:p>
-        </w:tc>
-        <w:tc>
-          <w:tcPr>
-            <w:tcW w:w="0" w:type="auto"/>
-          </w:tcPr>
-          <w:p>
-            <w:pPr>
-              <w:pStyle w:val="Compact"/>
-            </w:pPr>
-            <w:r>
-              <w:t>Metadata column used as facets in comparison plots.</w:t>
-            </w:r>
-          </w:p>
-        </w:tc>
-      </w:tr>
-      <w:tr>
-        <w:tc>
-          <w:tcPr>
-            <w:tcW w:w="0" w:type="auto"/>
-          </w:tcPr>
-          <w:p>
-            <w:pPr>
-              <w:pStyle w:val="Compact"/>
-            </w:pPr>
-            <w:r>
-              <w:rPr>
-                <w:rStyle w:val="VerbatimChar"/>
-              </w:rPr>
               <w:t>SUBTYPE_LEVELS</w:t>
             </w:r>
           </w:p>
@@ -10951,38 +10928,7 @@
               <w:pStyle w:val="Compact"/>
             </w:pPr>
             <w:r>
-              <w:t>Bar plots per pathway per sub-type.</w:t>
-            </w:r>
-          </w:p>
-        </w:tc>
-      </w:tr>
-      <w:tr>
-        <w:tc>
-          <w:tcPr>
-            <w:tcW w:w="0" w:type="auto"/>
-          </w:tcPr>
-          <w:p>
-            <w:pPr>
-              <w:pStyle w:val="Compact"/>
-            </w:pPr>
-            <w:r>
-              <w:rPr>
-                <w:rStyle w:val="VerbatimChar"/>
-              </w:rPr>
-              <w:t>cell_scoring/&lt;pop&gt;_pathways/plots_violin/*.png</w:t>
-            </w:r>
-          </w:p>
-        </w:tc>
-        <w:tc>
-          <w:tcPr>
-            <w:tcW w:w="0" w:type="auto"/>
-          </w:tcPr>
-          <w:p>
-            <w:pPr>
-              <w:pStyle w:val="Compact"/>
-            </w:pPr>
-            <w:r>
-              <w:t xml:space="preserve">Violin plots per </w:t>
+              <w:t xml:space="preserve">Bar plots per </w:t>
               <w:lastRenderedPageBreak/>
               <w:t>pathway per sub-type.</w:t>
             </w:r>
@@ -11003,6 +10949,37 @@
                 <w:rStyle w:val="VerbatimChar"/>
               </w:rPr>
               <w:lastRenderedPageBreak/>
+              <w:t>cell_scoring/&lt;pop&gt;_pathways/plots_violin/*.png</w:t>
+            </w:r>
+          </w:p>
+        </w:tc>
+        <w:tc>
+          <w:tcPr>
+            <w:tcW w:w="0" w:type="auto"/>
+          </w:tcPr>
+          <w:p>
+            <w:pPr>
+              <w:pStyle w:val="Compact"/>
+            </w:pPr>
+            <w:r>
+              <w:t>Violin plots per pathway per sub-type.</w:t>
+            </w:r>
+          </w:p>
+        </w:tc>
+      </w:tr>
+      <w:tr>
+        <w:tc>
+          <w:tcPr>
+            <w:tcW w:w="0" w:type="auto"/>
+          </w:tcPr>
+          <w:p>
+            <w:pPr>
+              <w:pStyle w:val="Compact"/>
+            </w:pPr>
+            <w:r>
+              <w:rPr>
+                <w:rStyle w:val="VerbatimChar"/>
+              </w:rPr>
               <w:t>cell_scoring/&lt;pop&gt;_pathways/pseudobulk_pathway_scores.csv</w:t>
             </w:r>
           </w:p>
@@ -11728,19 +11705,22 @@
               <w:pStyle w:val="Compact"/>
             </w:pPr>
             <w:r>
-              <w:t>DCS (Deep Crypt Secretory)</w:t>
-            </w:r>
-          </w:p>
-        </w:tc>
-        <w:tc>
-          <w:tcPr>
-            <w:tcW w:w="0" w:type="auto"/>
-          </w:tcPr>
-          <w:p>
-            <w:pPr>
-              <w:pStyle w:val="Compact"/>
-            </w:pPr>
-            <w:r>
+              <w:t xml:space="preserve">DCS (Deep Crypt </w:t>
+              <w:lastRenderedPageBreak/>
+              <w:t>Secretory)</w:t>
+            </w:r>
+          </w:p>
+        </w:tc>
+        <w:tc>
+          <w:tcPr>
+            <w:tcW w:w="0" w:type="auto"/>
+          </w:tcPr>
+          <w:p>
+            <w:pPr>
+              <w:pStyle w:val="Compact"/>
+            </w:pPr>
+            <w:r>
+              <w:lastRenderedPageBreak/>
               <w:t>Reg4, Ccl6, Dll1</w:t>
             </w:r>
           </w:p>
@@ -11784,7 +11764,6 @@
               <w:pStyle w:val="Compact"/>
             </w:pPr>
             <w:r>
-              <w:lastRenderedPageBreak/>
               <w:t>TA cells</w:t>
             </w:r>
           </w:p>
@@ -12642,20 +12621,25 @@
               <w:pStyle w:val="Compact"/>
             </w:pPr>
             <w:r>
-              <w:t>“No valid pK in range” warning</w:t>
-            </w:r>
-          </w:p>
-        </w:tc>
-        <w:tc>
-          <w:tcPr>
-            <w:tcW w:w="0" w:type="auto"/>
-          </w:tcPr>
-          <w:p>
-            <w:pPr>
-              <w:pStyle w:val="Compact"/>
-            </w:pPr>
-            <w:r>
-              <w:t>The optimal pK fell outside the configured range. The fallback pK (</w:t>
+              <w:t xml:space="preserve">“No valid pK in </w:t>
+              <w:lastRenderedPageBreak/>
+              <w:t>range” warning</w:t>
+            </w:r>
+          </w:p>
+        </w:tc>
+        <w:tc>
+          <w:tcPr>
+            <w:tcW w:w="0" w:type="auto"/>
+          </w:tcPr>
+          <w:p>
+            <w:pPr>
+              <w:pStyle w:val="Compact"/>
+            </w:pPr>
+            <w:r>
+              <w:lastRenderedPageBreak/>
+              <w:t xml:space="preserve">The optimal pK fell outside the configured range. The fallback pK </w:t>
+              <w:lastRenderedPageBreak/>
+              <w:t>(</w:t>
             </w:r>
             <w:r>
               <w:rPr>
@@ -12670,7 +12654,7 @@
               <w:rPr>
                 <w:rStyle w:val="VerbatimChar"/>
               </w:rPr>
-              <w:t>doublet_finder_plots/</w:t>
+              <w:t>scevan_per_sample_results/&lt;sample&gt;/</w:t>
             </w:r>
             <w:r>
               <w:t xml:space="preserve">. Consider widening </w:t>
@@ -13343,6 +13327,47 @@
             </w:pPr>
             <w:r>
               <w:t>SCEVAN split into dedicated two-loop memory architecture (Step 2.1a/2.1b) to prevent crashes in large cohorts; parameter tables reformatted throughout; Section 3 (Metadata Configuration) added</w:t>
+            </w:r>
+          </w:p>
+        </w:tc>
+      </w:tr>
+      <w:tr>
+        <w:tc>
+          <w:tcPr>
+            <w:tcW w:w="0" w:type="auto"/>
+          </w:tcPr>
+          <w:p>
+            <w:pPr>
+              <w:pStyle w:val="Compact"/>
+            </w:pPr>
+            <w:r>
+              <w:t>6.0</w:t>
+            </w:r>
+          </w:p>
+        </w:tc>
+        <w:tc>
+          <w:tcPr>
+            <w:tcW w:w="0" w:type="auto"/>
+          </w:tcPr>
+          <w:p>
+            <w:pPr>
+              <w:pStyle w:val="Compact"/>
+            </w:pPr>
+            <w:r>
+              <w:t>April 2026</w:t>
+            </w:r>
+          </w:p>
+        </w:tc>
+        <w:tc>
+          <w:tcPr>
+            <w:tcW w:w="0" w:type="auto"/>
+          </w:tcPr>
+          <w:p>
+            <w:pPr>
+              <w:pStyle w:val="Compact"/>
+            </w:pPr>
+            <w:r>
+              <w:t>Script 01 v9.0: per-sample pipeline reorganized — SCEVAN, DecontX, and DoubletFinder now all run per-sample before merging (new order: SCEVAN → Pre-QC → DecontX → DoubletFinder → Remove Doublets → Checkpoint); added ROUND_DECONTX_COUNTS toggle for optional integer rounding of decontX counts; BPCells on-disk matrix handling (hdf5r + BPCells) incorporated; Leiden clustering algorithm used for both PCA and Harmony tracks; per-sample pK and doublet UMAP plots saved to each sample’s checkpoint directory; rollback log written after all samples complete; pipeline reduced from 7 to 5 post-merge steps</w:t>
             </w:r>
           </w:p>
         </w:tc>
@@ -14707,6 +14732,15 @@
       <w:shd w:val="clear" w:color="auto" w:fill="F8F8F8"/>
     </w:rPr>
   </w:style>
+  <w:style w:type="character" w:styleId="FollowedHyperlink">
+    <w:name w:val="FollowedHyperlink"/>
+    <w:basedOn w:val="DefaultParagraphFont"/>
+    <w:rsid w:val="00CE7EBD"/>
+    <w:rPr>
+      <w:color w:val="800080" w:themeColor="followedHyperlink"/>
+      <w:u w:val="single"/>
+    </w:rPr>
+  </w:style>
 </w:styles>
 </file>
 

</xml_diff>

<commit_message>
Newer unifieed pipeline 11.1 update.
</commit_message>
<xml_diff>
--- a/single_cell_standard_pipeline/single-cell Standard Operating Procedure.docx
+++ b/single_cell_standard_pipeline/single-cell Standard Operating Procedure.docx
@@ -2321,19 +2321,19 @@
           </w:tcPr>
           <w:p>
             <w:r>
-              <w:t>"auto" for per-sample estimation, or a fixed fraction</w:t>
-            </w:r>
-          </w:p>
-        </w:tc>
-      </w:tr>
-      <w:tr>
-        <w:tc>
-          <w:tcPr>
-            <w:tcW w:type="dxa" w:w="3500"/>
-          </w:tcPr>
-          <w:p>
-            <w:r>
-              <w:t>DOUBLET_RATE_PER_1K</w:t>
+              <w:t>"auto" derives the rate; a number forces a fixed fraction</w:t>
+            </w:r>
+          </w:p>
+        </w:tc>
+      </w:tr>
+      <w:tr>
+        <w:tc>
+          <w:tcPr>
+            <w:tcW w:type="dxa" w:w="3500"/>
+          </w:tcPr>
+          <w:p>
+            <w:r>
+              <w:t>MULTIPLET_RATE_PER_1K</w:t>
             </w:r>
           </w:p>
         </w:tc>
@@ -2353,19 +2353,19 @@
           </w:tcPr>
           <w:p>
             <w:r>
-              <w:t>Slope of the 10x multiplet model</w:t>
-            </w:r>
-          </w:p>
-        </w:tc>
-      </w:tr>
-      <w:tr>
-        <w:tc>
-          <w:tcPr>
-            <w:tcW w:type="dxa" w:w="3500"/>
-          </w:tcPr>
-          <w:p>
-            <w:r>
-              <w:t>DOUBLET_RATE_AUTO_MIN</w:t>
+              <w:t>Slope of the 10x model. Internal; not a tuning knob</w:t>
+            </w:r>
+          </w:p>
+        </w:tc>
+      </w:tr>
+      <w:tr>
+        <w:tc>
+          <w:tcPr>
+            <w:tcW w:type="dxa" w:w="3500"/>
+          </w:tcPr>
+          <w:p>
+            <w:r>
+              <w:t>DOUBLET_RATE_FLOOR</w:t>
             </w:r>
           </w:p>
         </w:tc>
@@ -2397,7 +2397,7 @@
           </w:tcPr>
           <w:p>
             <w:r>
-              <w:t>DOUBLET_RATE_AUTO_MAX</w:t>
+              <w:t>DOUBLET_RATE_CEILING</w:t>
             </w:r>
           </w:p>
         </w:tc>
@@ -2457,6 +2457,187 @@
     </w:tbl>
     <w:p>
       <w:pPr/>
+    </w:p>
+    <w:p>
+      <w:pPr>
+        <w:pStyle w:val="Heading4"/>
+      </w:pPr>
+      <w:r>
+        <w:t>Multiplexed runs (10x Flex, CellPlex, hashing)</w:t>
+      </w:r>
+    </w:p>
+    <w:p>
+      <w:pPr>
+        <w:pStyle w:val="FirstParagraph"/>
+      </w:pPr>
+      <w:r>
+        <w:t>If several samples shared one GEM well, leave EXPECTED_CELLS_PER_SAMPLE as NULL and never enter the GEM-well total.</w:t>
+      </w:r>
+    </w:p>
+    <w:p>
+      <w:pPr>
+        <w:pStyle w:val="BodyText"/>
+      </w:pPr>
+      <w:r>
+        <w:t>Cell Ranger demultiplexes by probe barcode and already removes multiplets whose two cells came from different samples. Only UNDETECTED multiplets - those where both cells carry the same barcode - reach the per-sample H5. For k equally sized barcodes that is a fraction 1/k of all multiplets. Because the rate model is linear, dividing the cell count by k and dividing the rate by k arrive at the same number, so each sample's own measured count is exactly correct here rather than an approximation.</w:t>
+      </w:r>
+    </w:p>
+    <w:tbl>
+      <w:tblPr>
+        <w:tblStyle w:val="Table"/>
+        <w:tblW w:type="auto" w:w="0"/>
+        <w:tblLayout w:type="fixed"/>
+        <w:tblLook w:firstColumn="1" w:firstRow="1" w:lastColumn="0" w:lastRow="0" w:noHBand="0" w:noVBand="1" w:val="04A0"/>
+      </w:tblPr>
+      <w:tblGrid>
+        <w:gridCol w:w="3900"/>
+        <w:gridCol w:w="3600"/>
+        <w:gridCol w:w="1860"/>
+      </w:tblGrid>
+      <w:tr>
+        <w:tc>
+          <w:tcPr>
+            <w:tcW w:type="dxa" w:w="3900"/>
+          </w:tcPr>
+          <w:p>
+            <w:r/>
+            <w:r>
+              <w:rPr>
+                <w:b/>
+              </w:rPr>
+              <w:t>Basis</w:t>
+            </w:r>
+          </w:p>
+        </w:tc>
+        <w:tc>
+          <w:tcPr>
+            <w:tcW w:type="dxa" w:w="3600"/>
+          </w:tcPr>
+          <w:p>
+            <w:r/>
+            <w:r>
+              <w:rPr>
+                <w:b/>
+              </w:rPr>
+              <w:t>Calculation</w:t>
+            </w:r>
+          </w:p>
+        </w:tc>
+        <w:tc>
+          <w:tcPr>
+            <w:tcW w:type="dxa" w:w="1860"/>
+          </w:tcPr>
+          <w:p>
+            <w:r/>
+            <w:r>
+              <w:rPr>
+                <w:b/>
+              </w:rPr>
+              <w:t>Rate</w:t>
+            </w:r>
+          </w:p>
+        </w:tc>
+      </w:tr>
+      <w:tr>
+        <w:tc>
+          <w:tcPr>
+            <w:tcW w:type="dxa" w:w="3900"/>
+          </w:tcPr>
+          <w:p>
+            <w:r>
+              <w:t>Whole 4-plex GEM well (80,000 cells)</w:t>
+            </w:r>
+          </w:p>
+        </w:tc>
+        <w:tc>
+          <w:tcPr>
+            <w:tcW w:type="dxa" w:w="3600"/>
+          </w:tcPr>
+          <w:p>
+            <w:r>
+              <w:t>0.008 x 80 = 64%, divided by 4 barcodes</w:t>
+            </w:r>
+          </w:p>
+        </w:tc>
+        <w:tc>
+          <w:tcPr>
+            <w:tcW w:type="dxa" w:w="1860"/>
+          </w:tcPr>
+          <w:p>
+            <w:r>
+              <w:t>16%</w:t>
+            </w:r>
+          </w:p>
+        </w:tc>
+      </w:tr>
+      <w:tr>
+        <w:tc>
+          <w:tcPr>
+            <w:tcW w:type="dxa" w:w="3900"/>
+          </w:tcPr>
+          <w:p>
+            <w:r>
+              <w:t>One sample's own count (20,000 cells)</w:t>
+            </w:r>
+          </w:p>
+        </w:tc>
+        <w:tc>
+          <w:tcPr>
+            <w:tcW w:type="dxa" w:w="3600"/>
+          </w:tcPr>
+          <w:p>
+            <w:r>
+              <w:t>0.008 x 20</w:t>
+            </w:r>
+          </w:p>
+        </w:tc>
+        <w:tc>
+          <w:tcPr>
+            <w:tcW w:type="dxa" w:w="1860"/>
+          </w:tcPr>
+          <w:p>
+            <w:r>
+              <w:t>16%</w:t>
+            </w:r>
+          </w:p>
+        </w:tc>
+      </w:tr>
+    </w:tbl>
+    <w:p>
+      <w:pPr>
+        <w:pStyle w:val="BodyText"/>
+      </w:pPr>
+      <w:r>
+        <w:t>Before running, confirm the pipeline is reading per-sample files and not GEM-well totals. The counts printed should be per probe barcode:</w:t>
+      </w:r>
+    </w:p>
+    <w:p>
+      <w:pPr>
+        <w:pStyle w:val="SourceCode"/>
+      </w:pPr>
+      <w:r>
+        <w:t>library(hdf5r)</w:t>
+        <w:br/>
+        <w:t>for (f in list.files(H5_DIR, pattern = "sample_filtered_feature_bc_matrix.h5$",</w:t>
+        <w:br/>
+        <w:t xml:space="preserve">                     recursive = TRUE, full.names = TRUE)) {</w:t>
+        <w:br/>
+        <w:t xml:space="preserve">  h &lt;- H5File$new(f, "r")</w:t>
+        <w:br/>
+        <w:t xml:space="preserve">  cat(sprintf("%-20s %6d cells\n", basename(dirname(f)), h[["matrix/barcodes"]]$dims))</w:t>
+        <w:br/>
+        <w:t xml:space="preserve">  h$close_all()</w:t>
+        <w:br/>
+        <w:t>}</w:t>
+      </w:r>
+    </w:p>
+    <w:p>
+      <w:pPr>
+        <w:pStyle w:val="BlockText"/>
+      </w:pPr>
+      <w:r>
+        <w:t>CAVEAT: 10x caps Flex at 20,000 cells per probe barcode and recommends 4,000 as a starting point, noting that the undetected multiplet rate rises as the cap is approached. At approximately 20,000 cells per barcode a rate near 16% is expected and real rather than an artifact - but the doublet step is then removing a substantial number of cells, so the Action and Target_Rate_Pct columns of the doublet log should be reviewed carefully.</w:t>
+      </w:r>
     </w:p>
     <w:p>
       <w:pPr>
@@ -2603,7 +2784,7 @@
           </w:tcPr>
           <w:p>
             <w:r>
-              <w:t>0.15</w:t>
+              <w:t>0.25</w:t>
             </w:r>
           </w:p>
         </w:tc>
@@ -2988,6 +3169,470 @@
       </w:pPr>
       <w:r>
         <w:t>&lt;sample&gt;_DF_pk_plot.png — the selected pK should sit on a real peak inside the shaded plausible band, not on a noisy shoulder.</w:t>
+      </w:r>
+    </w:p>
+    <w:p>
+      <w:pPr>
+        <w:pStyle w:val="Heading4"/>
+      </w:pPr>
+      <w:r>
+        <w:t>Why the two scores are never combined</w:t>
+      </w:r>
+    </w:p>
+    <w:p>
+      <w:pPr>
+        <w:pStyle w:val="FirstParagraph"/>
+      </w:pPr>
+      <w:r>
+        <w:t>When DOUBLET_METHOD is 'both', the pipeline stores each method's score separately and never averages them. The two numbers are not on the same scale.</w:t>
+      </w:r>
+    </w:p>
+    <w:tbl>
+      <w:tblPr>
+        <w:tblStyle w:val="Table"/>
+        <w:tblW w:type="auto" w:w="0"/>
+        <w:tblLayout w:type="fixed"/>
+        <w:tblLook w:firstColumn="1" w:firstRow="1" w:lastColumn="0" w:lastRow="0" w:noHBand="0" w:noVBand="1" w:val="04A0"/>
+      </w:tblPr>
+      <w:tblGrid>
+        <w:gridCol w:w="3200"/>
+        <w:gridCol w:w="2800"/>
+        <w:gridCol w:w="3360"/>
+      </w:tblGrid>
+      <w:tr>
+        <w:tc>
+          <w:tcPr>
+            <w:tcW w:type="dxa" w:w="3200"/>
+          </w:tcPr>
+          <w:p>
+            <w:r/>
+            <w:r>
+              <w:rPr>
+                <w:b/>
+              </w:rPr>
+              <w:t>Column</w:t>
+            </w:r>
+          </w:p>
+        </w:tc>
+        <w:tc>
+          <w:tcPr>
+            <w:tcW w:type="dxa" w:w="2800"/>
+          </w:tcPr>
+          <w:p>
+            <w:r/>
+            <w:r>
+              <w:rPr>
+                <w:b/>
+              </w:rPr>
+              <w:t>Range</w:t>
+            </w:r>
+          </w:p>
+        </w:tc>
+        <w:tc>
+          <w:tcPr>
+            <w:tcW w:type="dxa" w:w="3360"/>
+          </w:tcPr>
+          <w:p>
+            <w:r/>
+            <w:r>
+              <w:rPr>
+                <w:b/>
+              </w:rPr>
+              <w:t>Meaning</w:t>
+            </w:r>
+          </w:p>
+        </w:tc>
+      </w:tr>
+      <w:tr>
+        <w:tc>
+          <w:tcPr>
+            <w:tcW w:type="dxa" w:w="3200"/>
+          </w:tcPr>
+          <w:p>
+            <w:r>
+              <w:t>DF_score</w:t>
+            </w:r>
+          </w:p>
+        </w:tc>
+        <w:tc>
+          <w:tcPr>
+            <w:tcW w:type="dxa" w:w="2800"/>
+          </w:tcPr>
+          <w:p>
+            <w:r>
+              <w:t>approx. 0 to 0.5+, varies with pK and pN</w:t>
+            </w:r>
+          </w:p>
+        </w:tc>
+        <w:tc>
+          <w:tcPr>
+            <w:tcW w:type="dxa" w:w="3360"/>
+          </w:tcPr>
+          <w:p>
+            <w:r>
+              <w:t>pANN: proportion of artificial nearest neighbours</w:t>
+            </w:r>
+          </w:p>
+        </w:tc>
+      </w:tr>
+      <w:tr>
+        <w:tc>
+          <w:tcPr>
+            <w:tcW w:type="dxa" w:w="3200"/>
+          </w:tcPr>
+          <w:p>
+            <w:r>
+              <w:t>scDblFinder_score</w:t>
+            </w:r>
+          </w:p>
+        </w:tc>
+        <w:tc>
+          <w:tcPr>
+            <w:tcW w:type="dxa" w:w="2800"/>
+          </w:tcPr>
+          <w:p>
+            <w:r>
+              <w:t>0 to 1, calibrated</w:t>
+            </w:r>
+          </w:p>
+        </w:tc>
+        <w:tc>
+          <w:tcPr>
+            <w:tcW w:type="dxa" w:w="3360"/>
+          </w:tcPr>
+          <w:p>
+            <w:r>
+              <w:t>classifier probability</w:t>
+            </w:r>
+          </w:p>
+        </w:tc>
+      </w:tr>
+    </w:tbl>
+    <w:p>
+      <w:pPr>
+        <w:pStyle w:val="BodyText"/>
+      </w:pPr>
+      <w:r>
+        <w:t>A pANN of 0.35 and an scDblFinder score of 0.35 do not mean the same thing, so averaging them would be arithmetic on incompatible units. The consensus in DOUBLET_CONSENSUS_RULE is therefore computed on the BINARY CALLS (DF_class and scDblFinder_class), never on the scores. If a single continuous value is wanted for downstream filtering, it should be built from within-sample percentile ranks rather than the raw scores.</w:t>
+      </w:r>
+    </w:p>
+    <w:p>
+      <w:pPr>
+        <w:pStyle w:val="SourceCode"/>
+      </w:pPr>
+      <w:r>
+        <w:t>rank01 &lt;- function(x) rank(x, na.last = "keep") / sum(!is.na(x))</w:t>
+        <w:br/>
+        <w:t>data$doublet_score_combined &lt;- rowMeans(cbind(rank01(data$DF_score),</w:t>
+        <w:br/>
+        <w:t xml:space="preserve">                                              rank01(data$scDblFinder_score)),</w:t>
+        <w:br/>
+        <w:t xml:space="preserve">                                        na.rm = TRUE)</w:t>
+      </w:r>
+    </w:p>
+    <w:p>
+      <w:pPr>
+        <w:pStyle w:val="Heading4"/>
+      </w:pPr>
+      <w:r>
+        <w:t>Doublet diagnostic plots</w:t>
+      </w:r>
+    </w:p>
+    <w:p>
+      <w:pPr>
+        <w:pStyle w:val="FirstParagraph"/>
+      </w:pPr>
+      <w:r>
+        <w:t>All plots are written to seurat_output/doublet_diagnostics/, one set per sample.</w:t>
+      </w:r>
+    </w:p>
+    <w:tbl>
+      <w:tblPr>
+        <w:tblStyle w:val="Table"/>
+        <w:tblW w:type="auto" w:w="0"/>
+        <w:tblLayout w:type="fixed"/>
+        <w:tblLook w:firstColumn="1" w:firstRow="1" w:lastColumn="0" w:lastRow="0" w:noHBand="0" w:noVBand="1" w:val="04A0"/>
+      </w:tblPr>
+      <w:tblGrid>
+        <w:gridCol w:w="3700"/>
+        <w:gridCol w:w="1700"/>
+        <w:gridCol w:w="3960"/>
+      </w:tblGrid>
+      <w:tr>
+        <w:tc>
+          <w:tcPr>
+            <w:tcW w:type="dxa" w:w="3700"/>
+          </w:tcPr>
+          <w:p>
+            <w:r/>
+            <w:r>
+              <w:rPr>
+                <w:b/>
+              </w:rPr>
+              <w:t>File</w:t>
+            </w:r>
+          </w:p>
+        </w:tc>
+        <w:tc>
+          <w:tcPr>
+            <w:tcW w:type="dxa" w:w="1700"/>
+          </w:tcPr>
+          <w:p>
+            <w:r/>
+            <w:r>
+              <w:rPr>
+                <w:b/>
+              </w:rPr>
+              <w:t>When</w:t>
+            </w:r>
+          </w:p>
+        </w:tc>
+        <w:tc>
+          <w:tcPr>
+            <w:tcW w:type="dxa" w:w="3960"/>
+          </w:tcPr>
+          <w:p>
+            <w:r/>
+            <w:r>
+              <w:rPr>
+                <w:b/>
+              </w:rPr>
+              <w:t>Shows</w:t>
+            </w:r>
+          </w:p>
+        </w:tc>
+      </w:tr>
+      <w:tr>
+        <w:tc>
+          <w:tcPr>
+            <w:tcW w:type="dxa" w:w="3700"/>
+          </w:tcPr>
+          <w:p>
+            <w:r>
+              <w:t>&lt;sample&gt;_DF_pk_plot.png</w:t>
+            </w:r>
+          </w:p>
+        </w:tc>
+        <w:tc>
+          <w:tcPr>
+            <w:tcW w:type="dxa" w:w="1700"/>
+          </w:tcPr>
+          <w:p>
+            <w:r>
+              <w:t>DoubletFinder ran</w:t>
+            </w:r>
+          </w:p>
+        </w:tc>
+        <w:tc>
+          <w:tcPr>
+            <w:tcW w:type="dxa" w:w="3960"/>
+          </w:tcPr>
+          <w:p>
+            <w:r>
+              <w:t>BCmetric curve, selected pK, plausible band. A parameter decision that can be audited.</w:t>
+            </w:r>
+          </w:p>
+        </w:tc>
+      </w:tr>
+      <w:tr>
+        <w:tc>
+          <w:tcPr>
+            <w:tcW w:type="dxa" w:w="3700"/>
+          </w:tcPr>
+          <w:p>
+            <w:r>
+              <w:t>&lt;sample&gt;_scDbl_score_distribution.png</w:t>
+            </w:r>
+          </w:p>
+        </w:tc>
+        <w:tc>
+          <w:tcPr>
+            <w:tcW w:type="dxa" w:w="1700"/>
+          </w:tcPr>
+          <w:p>
+            <w:r>
+              <w:t>scDblFinder ran</w:t>
+            </w:r>
+          </w:p>
+        </w:tc>
+        <w:tc>
+          <w:tcPr>
+            <w:tcW w:type="dxa" w:w="3960"/>
+          </w:tcPr>
+          <w:p>
+            <w:r>
+              <w:t>Score histogram with threshold. A result rather than a decision - scDblFinder self-tunes, so there is no equivalent knob to inspect.</w:t>
+            </w:r>
+          </w:p>
+        </w:tc>
+      </w:tr>
+      <w:tr>
+        <w:tc>
+          <w:tcPr>
+            <w:tcW w:type="dxa" w:w="3700"/>
+          </w:tcPr>
+          <w:p>
+            <w:r>
+              <w:t>&lt;sample&gt;_doublet_umap_DoubletFinder.png</w:t>
+            </w:r>
+          </w:p>
+        </w:tc>
+        <w:tc>
+          <w:tcPr>
+            <w:tcW w:type="dxa" w:w="1700"/>
+          </w:tcPr>
+          <w:p>
+            <w:r>
+              <w:t>DoubletFinder ran</w:t>
+            </w:r>
+          </w:p>
+        </w:tc>
+        <w:tc>
+          <w:tcPr>
+            <w:tcW w:type="dxa" w:w="3960"/>
+          </w:tcPr>
+          <w:p>
+            <w:r>
+              <w:t>pANN score projected on UMAP</w:t>
+            </w:r>
+          </w:p>
+        </w:tc>
+      </w:tr>
+      <w:tr>
+        <w:tc>
+          <w:tcPr>
+            <w:tcW w:type="dxa" w:w="3700"/>
+          </w:tcPr>
+          <w:p>
+            <w:r>
+              <w:t>&lt;sample&gt;_doublet_umap_scDblFinder.png</w:t>
+            </w:r>
+          </w:p>
+        </w:tc>
+        <w:tc>
+          <w:tcPr>
+            <w:tcW w:type="dxa" w:w="1700"/>
+          </w:tcPr>
+          <w:p>
+            <w:r>
+              <w:t>scDblFinder ran</w:t>
+            </w:r>
+          </w:p>
+        </w:tc>
+        <w:tc>
+          <w:tcPr>
+            <w:tcW w:type="dxa" w:w="3960"/>
+          </w:tcPr>
+          <w:p>
+            <w:r>
+              <w:t>Probability projected on UMAP</w:t>
+            </w:r>
+          </w:p>
+        </w:tc>
+      </w:tr>
+      <w:tr>
+        <w:tc>
+          <w:tcPr>
+            <w:tcW w:type="dxa" w:w="3700"/>
+          </w:tcPr>
+          <w:p>
+            <w:r>
+              <w:t>&lt;sample&gt;_doublet_umap_call.png</w:t>
+            </w:r>
+          </w:p>
+        </w:tc>
+        <w:tc>
+          <w:tcPr>
+            <w:tcW w:type="dxa" w:w="1700"/>
+          </w:tcPr>
+          <w:p>
+            <w:r>
+              <w:t>Always</w:t>
+            </w:r>
+          </w:p>
+        </w:tc>
+        <w:tc>
+          <w:tcPr>
+            <w:tcW w:type="dxa" w:w="3960"/>
+          </w:tcPr>
+          <w:p>
+            <w:r>
+              <w:t>The final Doublet_Status call</w:t>
+            </w:r>
+          </w:p>
+        </w:tc>
+      </w:tr>
+      <w:tr>
+        <w:tc>
+          <w:tcPr>
+            <w:tcW w:type="dxa" w:w="3700"/>
+          </w:tcPr>
+          <w:p>
+            <w:r>
+              <w:t>&lt;sample&gt;_doublet_concordance.png</w:t>
+            </w:r>
+          </w:p>
+        </w:tc>
+        <w:tc>
+          <w:tcPr>
+            <w:tcW w:type="dxa" w:w="1700"/>
+          </w:tcPr>
+          <w:p>
+            <w:r>
+              <w:t>'both' only</w:t>
+            </w:r>
+          </w:p>
+        </w:tc>
+        <w:tc>
+          <w:tcPr>
+            <w:tcW w:type="dxa" w:w="3960"/>
+          </w:tcPr>
+          <w:p>
+            <w:r>
+              <w:t>2x2 confusion matrix, agreement percentage, Cohen's kappa</w:t>
+            </w:r>
+          </w:p>
+        </w:tc>
+      </w:tr>
+      <w:tr>
+        <w:tc>
+          <w:tcPr>
+            <w:tcW w:type="dxa" w:w="3700"/>
+          </w:tcPr>
+          <w:p>
+            <w:r>
+              <w:t>&lt;sample&gt;_doublet_umap_method_classification.png</w:t>
+            </w:r>
+          </w:p>
+        </w:tc>
+        <w:tc>
+          <w:tcPr>
+            <w:tcW w:type="dxa" w:w="1700"/>
+          </w:tcPr>
+          <w:p>
+            <w:r>
+              <w:t>'both' only</w:t>
+            </w:r>
+          </w:p>
+        </w:tc>
+        <w:tc>
+          <w:tcPr>
+            <w:tcW w:type="dxa" w:w="3960"/>
+          </w:tcPr>
+          <w:p>
+            <w:r>
+              <w:t>Where the two methods disagree. Read this first.</w:t>
+            </w:r>
+          </w:p>
+        </w:tc>
+      </w:tr>
+    </w:tbl>
+    <w:p>
+      <w:pPr>
+        <w:pStyle w:val="BlockText"/>
+      </w:pPr>
+      <w:r>
+        <w:t>The method-classification map is the most informative panel in 'both' mode. It colours every cell as Both: singlet, Both: doublet, DoubletFinder only, or scDblFinder only. If the disagreements scatter randomly across the UMAP, the two callers are merely noisy at the margin and either is acceptable; the intersect rule is safe. If the disagreements concentrate on one cluster, one method is systematically wrong about a real population, and that cluster must be identified before either caller is trusted. Neither the agreement percentage nor Cohen's kappa will reveal this, because a single badly handled cluster can still leave overall agreement above 95%.</w:t>
       </w:r>
     </w:p>
     <w:p>
@@ -6746,7 +7391,7 @@
           </w:tcPr>
           <w:p>
             <w:r>
-              <w:t>sub_resolution</w:t>
+              <w:t>subcluster_resolution</w:t>
             </w:r>
           </w:p>
         </w:tc>

</xml_diff>